<commit_message>
Update Hướng dẫn IntelliJ
</commit_message>
<xml_diff>
--- a/module2/Hướng dẫn IntelliJ.docx
+++ b/module2/Hướng dẫn IntelliJ.docx
@@ -853,6 +853,7 @@
           <w:szCs w:val="28"/>
         </w:rPr>
       </w:pPr>
+      <w:bookmarkStart w:id="0" w:name="_GoBack"/>
       <w:r>
         <w:rPr>
           <w:rFonts w:ascii="Times New Roman" w:hAnsi="Times New Roman" w:cs="Times New Roman"/>
@@ -860,6 +861,119 @@
           <w:sz w:val="28"/>
           <w:szCs w:val="28"/>
         </w:rPr>
+        <w:t>Phím nóng</w:t>
+      </w:r>
+    </w:p>
+    <w:bookmarkEnd w:id="0"/>
+    <w:p>
+      <w:pPr>
+        <w:spacing w:after="0"/>
+        <w:rPr>
+          <w:rFonts w:ascii="Times New Roman" w:hAnsi="Times New Roman" w:cs="Times New Roman"/>
+          <w:sz w:val="28"/>
+          <w:szCs w:val="28"/>
+        </w:rPr>
+      </w:pPr>
+    </w:p>
+    <w:p>
+      <w:pPr>
+        <w:spacing w:after="0"/>
+        <w:rPr>
+          <w:rFonts w:ascii="Times New Roman" w:hAnsi="Times New Roman" w:cs="Times New Roman"/>
+          <w:sz w:val="28"/>
+          <w:szCs w:val="28"/>
+        </w:rPr>
+      </w:pPr>
+      <w:r>
+        <w:rPr>
+          <w:rFonts w:ascii="Times New Roman" w:hAnsi="Times New Roman" w:cs="Times New Roman"/>
+          <w:sz w:val="28"/>
+          <w:szCs w:val="28"/>
+        </w:rPr>
+        <w:t>Ctrl + D để tạo 1 dòng bên dưới, gọi là duplicate</w:t>
+      </w:r>
+    </w:p>
+    <w:p>
+      <w:pPr>
+        <w:spacing w:after="0"/>
+        <w:rPr>
+          <w:rFonts w:ascii="Times New Roman" w:hAnsi="Times New Roman" w:cs="Times New Roman"/>
+          <w:sz w:val="28"/>
+          <w:szCs w:val="28"/>
+        </w:rPr>
+      </w:pPr>
+      <w:r>
+        <w:rPr>
+          <w:rFonts w:ascii="Times New Roman" w:hAnsi="Times New Roman" w:cs="Times New Roman"/>
+          <w:sz w:val="28"/>
+          <w:szCs w:val="28"/>
+        </w:rPr>
+        <w:t>Ctrl + ? để comment code</w:t>
+      </w:r>
+    </w:p>
+    <w:p>
+      <w:pPr>
+        <w:spacing w:after="0"/>
+        <w:rPr>
+          <w:rFonts w:ascii="Times New Roman" w:hAnsi="Times New Roman" w:cs="Times New Roman"/>
+          <w:sz w:val="28"/>
+          <w:szCs w:val="28"/>
+        </w:rPr>
+      </w:pPr>
+      <w:r>
+        <w:rPr>
+          <w:rFonts w:ascii="Times New Roman" w:hAnsi="Times New Roman" w:cs="Times New Roman"/>
+          <w:sz w:val="28"/>
+          <w:szCs w:val="28"/>
+        </w:rPr>
+        <w:t>Ctrl + Alt + O để tối ưu import</w:t>
+      </w:r>
+    </w:p>
+    <w:p>
+      <w:pPr>
+        <w:spacing w:after="0"/>
+        <w:rPr>
+          <w:rFonts w:ascii="Times New Roman" w:hAnsi="Times New Roman" w:cs="Times New Roman"/>
+          <w:sz w:val="28"/>
+          <w:szCs w:val="28"/>
+        </w:rPr>
+      </w:pPr>
+      <w:r>
+        <w:rPr>
+          <w:rFonts w:ascii="Times New Roman" w:hAnsi="Times New Roman" w:cs="Times New Roman"/>
+          <w:sz w:val="28"/>
+          <w:szCs w:val="28"/>
+        </w:rPr>
+        <w:t>Giữ Ctrl + click vào tên class để xem nội dung của class</w:t>
+      </w:r>
+    </w:p>
+    <w:p>
+      <w:pPr>
+        <w:spacing w:after="0"/>
+        <w:rPr>
+          <w:rFonts w:ascii="Times New Roman" w:hAnsi="Times New Roman" w:cs="Times New Roman"/>
+          <w:sz w:val="28"/>
+          <w:szCs w:val="28"/>
+        </w:rPr>
+      </w:pPr>
+    </w:p>
+    <w:p>
+      <w:pPr>
+        <w:spacing w:after="0"/>
+        <w:rPr>
+          <w:rFonts w:ascii="Times New Roman" w:hAnsi="Times New Roman" w:cs="Times New Roman"/>
+          <w:b/>
+          <w:sz w:val="28"/>
+          <w:szCs w:val="28"/>
+        </w:rPr>
+      </w:pPr>
+      <w:r>
+        <w:rPr>
+          <w:rFonts w:ascii="Times New Roman" w:hAnsi="Times New Roman" w:cs="Times New Roman"/>
+          <w:b/>
+          <w:sz w:val="28"/>
+          <w:szCs w:val="28"/>
+        </w:rPr>
         <w:t>Hello World</w:t>
       </w:r>
     </w:p>
@@ -890,6 +1004,7 @@
           <w:sz w:val="28"/>
           <w:szCs w:val="28"/>
         </w:rPr>
+        <w:lastRenderedPageBreak/>
         <w:drawing>
           <wp:inline distT="0" distB="0" distL="0" distR="0">
             <wp:extent cx="4084320" cy="1598212"/>
@@ -1557,6 +1672,7 @@
           <w:sz w:val="28"/>
           <w:szCs w:val="28"/>
         </w:rPr>
+        <w:lastRenderedPageBreak/>
         <w:t>Tuy nhiên, phép chia lại yêu cầu kiểm tra b khác 0</w:t>
       </w:r>
       <w:r>
@@ -1813,7 +1929,6 @@
           <w:sz w:val="24"/>
           <w:szCs w:val="24"/>
         </w:rPr>
-        <w:lastRenderedPageBreak/>
         <w:t xml:space="preserve">            </w:t>
       </w:r>
       <w:r>
@@ -2214,6 +2329,7 @@
           <w:sz w:val="24"/>
           <w:szCs w:val="28"/>
         </w:rPr>
+        <w:lastRenderedPageBreak/>
         <w:t xml:space="preserve">            return 0;</w:t>
       </w:r>
     </w:p>
@@ -2424,7 +2540,6 @@
           <w:sz w:val="24"/>
           <w:szCs w:val="24"/>
         </w:rPr>
-        <w:lastRenderedPageBreak/>
         <w:t xml:space="preserve">        int b = sc.nextInt();</w:t>
       </w:r>
     </w:p>
@@ -2927,6 +3042,7 @@
           <w:sz w:val="28"/>
           <w:szCs w:val="28"/>
         </w:rPr>
+        <w:lastRenderedPageBreak/>
         <w:t>Click chuột phải vào</w:t>
       </w:r>
       <w:r>
@@ -3343,6 +3459,7 @@
           <w:sz w:val="28"/>
           <w:szCs w:val="28"/>
         </w:rPr>
+        <w:lastRenderedPageBreak/>
         <w:t>Hàm để trả về kết quả</w:t>
       </w:r>
     </w:p>
@@ -3504,7 +3621,6 @@
           <w:sz w:val="28"/>
           <w:szCs w:val="28"/>
         </w:rPr>
-        <w:lastRenderedPageBreak/>
         <w:drawing>
           <wp:inline distT="0" distB="0" distL="0" distR="0">
             <wp:extent cx="4137660" cy="1391172"/>
@@ -3797,8 +3913,6 @@
           <w:szCs w:val="28"/>
         </w:rPr>
       </w:pPr>
-      <w:bookmarkStart w:id="0" w:name="_GoBack"/>
-      <w:bookmarkEnd w:id="0"/>
     </w:p>
     <w:p>
       <w:pPr>
@@ -3977,6 +4091,7 @@
           <w:sz w:val="28"/>
           <w:szCs w:val="28"/>
         </w:rPr>
+        <w:lastRenderedPageBreak/>
         <w:drawing>
           <wp:inline distT="0" distB="0" distL="0" distR="0">
             <wp:extent cx="2435197" cy="2446020"/>
@@ -4052,7 +4167,6 @@
           <w:sz w:val="28"/>
           <w:szCs w:val="28"/>
         </w:rPr>
-        <w:lastRenderedPageBreak/>
         <w:t>Bài tập:</w:t>
       </w:r>
     </w:p>

</xml_diff>